<commit_message>
docs: Update executive report with ₦2,500 monthly Covenant Partner pricing and revenue projections
</commit_message>
<xml_diff>
--- a/LCM_Audios_Executive_Project_Report.docx
+++ b/LCM_Audios_Executive_Project_Report.docx
@@ -235,7 +235,7 @@
     </w:p>
     <w:p>
       <w:r>
-        <w:t>I am pleased to present the comprehensive technical, operational, and commercial architecture report for the LCM Audios streaming platform. Engineered as a flagship Christian media technology ecosystem, LCM Audios combines high-fidelity sermon streaming, interactive discipleship tools (timestamped note-taking and synchronized lyrics), and an automated recurring partnership monetization model ('Covenant Partner Tier'). Crucially, the entire infrastructure has been optimized to run at $0.00/month in cloud overhead while scaling to support over 2,000 sermons and tens of thousands of worshippers worldwide.</w:t>
+        <w:t>I am pleased to present the comprehensive technical, operational, and commercial architecture report for the LCM Audios streaming platform. Engineered as a flagship Christian media technology ecosystem, LCM Audios combines high-fidelity sermon streaming, interactive discipleship tools (timestamped note-taking and synchronized lyrics), and an automated recurring partnership monetization model ('Covenant Partner Tier' at ₦2,500/month). Crucially, the entire infrastructure has been optimized to run at $0.00/month in cloud overhead while scaling to support over 2,000 sermons and tens of thousands of worshippers worldwide.</w:t>
       </w:r>
     </w:p>
     <w:p>
@@ -718,7 +718,7 @@
         <w:rPr>
           <w:color w:val="B4141E"/>
         </w:rPr>
-        <w:t>3. The 'Covenant Partner' Business &amp; Monetization Model</w:t>
+        <w:t>3. The 'Covenant Partner' Business &amp; Monetization Model (₦2,500 / Month)</w:t>
       </w:r>
     </w:p>
     <w:p>
@@ -862,7 +862,7 @@
                 <w:color w:val="A07800"/>
                 <w:sz w:val="18"/>
               </w:rPr>
-              <w:t>Full Unlimited Streaming (Hi-Fi 320kbps)</w:t>
+              <w:t>Full Unlimited Streaming (Hi-Fi 320kbps Studio Quality)</w:t>
             </w:r>
           </w:p>
         </w:tc>
@@ -1187,7 +1187,7 @@
                 <w:color w:val="A07800"/>
                 <w:sz w:val="18"/>
               </w:rPr>
-              <w:t>Monthly (₦1,500 / $5) or Annual (₦15,000 / $50) Seed</w:t>
+              <w:t>Monthly (₦2,500 / Month) or Annual (₦24,000 / Year) Seed</w:t>
             </w:r>
           </w:p>
         </w:tc>
@@ -1199,15 +1199,17 @@
         <w:rPr>
           <w:b/>
         </w:rPr>
-        <w:t>Revenue &amp; Ministry Impact Projections:</w:t>
+        <w:t>Revenue &amp; Ministry Impact Projections (at ₦2,500 / Month):</w:t>
         <w:br/>
       </w:r>
       <w:r>
-        <w:t>• Evangelism Funnel: The Free Tier removes all barriers for new believers and searchers, driving massive viral adoption.</w:t>
+        <w:t>• Evangelism Growth Engine: The Free Tier eliminates entry friction for new converts and worshippers globally, driving wide-scale adoption.</w:t>
         <w:br/>
-        <w:t>• Recurring Kingdom Revenue: Converting just 500 dedicated worshippers into Covenant Gold Partners (₦1,500/mo) generates ₦750,000 / month (₦9,000,000 / year) in steady, automated operational funding with 0% server overhead.</w:t>
+        <w:t>• 500 Covenant Gold Partners (₦2,500/mo): Generates ₦1,250,000 / month (₦15,000,000 / year) in steady, automated ministry support.</w:t>
         <w:br/>
-        <w:t>• Automated Financial Governance: Every partnership is verified via Paystack webhooks with instant digital receipts recorded in the admin ledger.</w:t>
+        <w:t>• 1,000 Covenant Gold Partners (₦2,500/mo): Generates ₦2,500,000 / month (₦30,000,000 / year) in dedicated kingdom expansion capital with 0% server overhead.</w:t>
+        <w:br/>
+        <w:t>• Automated Financial Governance: Every transaction is verified via Paystack webhooks with instant digital receipts recorded in the admin ledger.</w:t>
       </w:r>
     </w:p>
     <w:p>

</xml_diff>